<commit_message>
fix: Update paths and documentation for repo structure
</commit_message>
<xml_diff>
--- a/SigSparse_Sampath_TA_Report.docx
+++ b/SigSparse_Sampath_TA_Report.docx
@@ -10,12 +10,21 @@
           <w:bCs/>
         </w:rPr>
       </w:pPr>
-      <w:r>
-        <w:rPr>
-          <w:b/>
-          <w:bCs/>
-        </w:rPr>
-        <w:t xml:space="preserve">SigSparse - </w:t>
+      <w:proofErr w:type="spellStart"/>
+      <w:r>
+        <w:rPr>
+          <w:b/>
+          <w:bCs/>
+        </w:rPr>
+        <w:t>SigSparse</w:t>
+      </w:r>
+      <w:proofErr w:type="spellEnd"/>
+      <w:r>
+        <w:rPr>
+          <w:b/>
+          <w:bCs/>
+        </w:rPr>
+        <w:t xml:space="preserve"> - </w:t>
       </w:r>
       <w:r>
         <w:rPr>
@@ -200,12 +209,25 @@
     </w:p>
     <w:p>
       <w:r>
-        <w:t>g = sigmoid(g_score)</w:t>
-      </w:r>
-    </w:p>
-    <w:p>
-      <w:r>
-        <w:t xml:space="preserve">W_pruned = W </w:t>
+        <w:t>g = sigmoid(</w:t>
+      </w:r>
+      <w:proofErr w:type="spellStart"/>
+      <w:r>
+        <w:t>g_score</w:t>
+      </w:r>
+      <w:proofErr w:type="spellEnd"/>
+      <w:r>
+        <w:t>)</w:t>
+      </w:r>
+    </w:p>
+    <w:p>
+      <w:proofErr w:type="spellStart"/>
+      <w:r>
+        <w:t>W_pruned</w:t>
+      </w:r>
+      <w:proofErr w:type="spellEnd"/>
+      <w:r>
+        <w:t xml:space="preserve"> = W </w:t>
       </w:r>
       <w:r>
         <w:rPr>
@@ -371,7 +393,23 @@
           <w:b/>
           <w:bCs/>
         </w:rPr>
-        <w:t>3.2 Custom Prunable Layer</w:t>
+        <w:t xml:space="preserve">3.2 Custom </w:t>
+      </w:r>
+      <w:proofErr w:type="spellStart"/>
+      <w:r>
+        <w:rPr>
+          <w:b/>
+          <w:bCs/>
+        </w:rPr>
+        <w:t>Prunable</w:t>
+      </w:r>
+      <w:proofErr w:type="spellEnd"/>
+      <w:r>
+        <w:rPr>
+          <w:b/>
+          <w:bCs/>
+        </w:rPr>
+        <w:t xml:space="preserve"> Layer</w:t>
       </w:r>
     </w:p>
     <w:p>
@@ -409,8 +447,13 @@
         </w:numPr>
       </w:pPr>
       <w:r>
-        <w:t>learnable gate_scores</w:t>
-      </w:r>
+        <w:t xml:space="preserve">learnable </w:t>
+      </w:r>
+      <w:proofErr w:type="spellStart"/>
+      <w:r>
+        <w:t>gate_scores</w:t>
+      </w:r>
+      <w:proofErr w:type="spellEnd"/>
     </w:p>
     <w:p>
       <w:pPr>
@@ -473,7 +516,15 @@
         <w:t>feed-forward neural network</w:t>
       </w:r>
       <w:r>
-        <w:t xml:space="preserve"> that uses custom prunable layers to enable learnable weight suppression.</w:t>
+        <w:t xml:space="preserve"> that uses custom </w:t>
+      </w:r>
+      <w:proofErr w:type="spellStart"/>
+      <w:r>
+        <w:t>prunable</w:t>
+      </w:r>
+      <w:proofErr w:type="spellEnd"/>
+      <w:r>
+        <w:t xml:space="preserve"> layers to enable learnable weight suppression.</w:t>
       </w:r>
     </w:p>
     <w:p>
@@ -524,16 +575,33 @@
           <w:numId w:val="24"/>
         </w:numPr>
       </w:pPr>
-      <w:r>
-        <w:rPr>
-          <w:b/>
-          <w:bCs/>
-        </w:rPr>
-        <w:t>PrunableLinear Layers:</w:t>
+      <w:proofErr w:type="spellStart"/>
+      <w:r>
+        <w:rPr>
+          <w:b/>
+          <w:bCs/>
+        </w:rPr>
+        <w:t>PrunableLinear</w:t>
+      </w:r>
+      <w:proofErr w:type="spellEnd"/>
+      <w:r>
+        <w:rPr>
+          <w:b/>
+          <w:bCs/>
+        </w:rPr>
+        <w:t xml:space="preserve"> Layers:</w:t>
       </w:r>
       <w:r>
         <w:br/>
-        <w:t>The network consists of multiple custom PrunableLinear layers. Each layer contains:</w:t>
+        <w:t xml:space="preserve">The network consists of multiple custom </w:t>
+      </w:r>
+      <w:proofErr w:type="spellStart"/>
+      <w:r>
+        <w:t>PrunableLinear</w:t>
+      </w:r>
+      <w:proofErr w:type="spellEnd"/>
+      <w:r>
+        <w:t xml:space="preserve"> layers. Each layer contains:</w:t>
       </w:r>
     </w:p>
     <w:p>
@@ -555,7 +623,15 @@
         </w:numPr>
       </w:pPr>
       <w:r>
-        <w:t xml:space="preserve">an additional learnable parameter called gate_scores </w:t>
+        <w:t xml:space="preserve">an additional learnable parameter called </w:t>
+      </w:r>
+      <w:proofErr w:type="spellStart"/>
+      <w:r>
+        <w:t>gate_scores</w:t>
+      </w:r>
+      <w:proofErr w:type="spellEnd"/>
+      <w:r>
+        <w:t xml:space="preserve"> </w:t>
       </w:r>
     </w:p>
     <w:p>
@@ -648,6 +724,9 @@
             <m:t>=W⊙g</m:t>
           </m:r>
           <m:r>
+            <m:rPr>
+              <m:sty m:val="p"/>
+            </m:rPr>
             <w:br/>
           </m:r>
         </m:oMath>
@@ -665,17 +744,42 @@
           <w:numId w:val="24"/>
         </w:numPr>
       </w:pPr>
+      <w:proofErr w:type="spellStart"/>
       <w:r>
         <w:rPr>
           <w:b/>
           <w:bCs/>
         </w:rPr>
         <w:lastRenderedPageBreak/>
-        <w:t>ReLU Activation:</w:t>
+        <w:t>ReLU</w:t>
+      </w:r>
+      <w:proofErr w:type="spellEnd"/>
+      <w:r>
+        <w:rPr>
+          <w:b/>
+          <w:bCs/>
+        </w:rPr>
+        <w:t xml:space="preserve"> Activation:</w:t>
       </w:r>
       <w:r>
         <w:br/>
-        <w:t xml:space="preserve">After each hidden prunable layer, a ReLU activation function is applied. This introduces non-linearity, enabling the network to learn complex patterns beyond simple linear relationships. </w:t>
+        <w:t xml:space="preserve">After each hidden </w:t>
+      </w:r>
+      <w:proofErr w:type="spellStart"/>
+      <w:r>
+        <w:t>prunable</w:t>
+      </w:r>
+      <w:proofErr w:type="spellEnd"/>
+      <w:r>
+        <w:t xml:space="preserve"> layer, a </w:t>
+      </w:r>
+      <w:proofErr w:type="spellStart"/>
+      <w:r>
+        <w:t>ReLU</w:t>
+      </w:r>
+      <w:proofErr w:type="spellEnd"/>
+      <w:r>
+        <w:t xml:space="preserve"> activation function is applied. This introduces non-linearity, enabling the network to learn complex patterns beyond simple linear relationships. </w:t>
       </w:r>
     </w:p>
     <w:p>
@@ -694,7 +798,15 @@
       </w:r>
       <w:r>
         <w:br/>
-        <w:t>The last prunable layer maps the learned features to 10 output neurons, corresponding to the 10 CIFAR-10 classes. The output represents raw class scores (logits), which are later used to compute classification loss.</w:t>
+        <w:t xml:space="preserve">The last </w:t>
+      </w:r>
+      <w:proofErr w:type="spellStart"/>
+      <w:r>
+        <w:t>prunable</w:t>
+      </w:r>
+      <w:proofErr w:type="spellEnd"/>
+      <w:r>
+        <w:t xml:space="preserve"> layer maps the learned features to 10 output neurons, corresponding to the 10 CIFAR-10 classes. The output represents raw class scores (logits), which are later used to compute classification loss.</w:t>
       </w:r>
     </w:p>
     <w:p>
@@ -702,6 +814,9 @@
         <w:jc w:val="center"/>
       </w:pPr>
       <w:r>
+        <w:rPr>
+          <w:noProof/>
+        </w:rPr>
         <w:drawing>
           <wp:inline distT="0" distB="0" distL="0" distR="0" wp14:anchorId="70049363" wp14:editId="7A9723FD">
             <wp:extent cx="5277587" cy="7125694"/>
@@ -778,7 +893,15 @@
         </w:numPr>
       </w:pPr>
       <w:r>
-        <w:t>Loss: CrossEntropy + λ × Sparsity Loss</w:t>
+        <w:t xml:space="preserve">Loss: </w:t>
+      </w:r>
+      <w:proofErr w:type="spellStart"/>
+      <w:r>
+        <w:t>CrossEntropy</w:t>
+      </w:r>
+      <w:proofErr w:type="spellEnd"/>
+      <w:r>
+        <w:t xml:space="preserve"> + λ × Sparsity Loss</w:t>
       </w:r>
     </w:p>
     <w:p>
@@ -1407,7 +1530,23 @@
     </w:p>
     <w:p>
       <w:r>
-        <w:t>A histogram of gate values was used to analyze pruning behavior.</w:t>
+        <w:t xml:space="preserve">A histogram of gate values was used to </w:t>
+      </w:r>
+      <w:proofErr w:type="spellStart"/>
+      <w:r>
+        <w:t>analyze</w:t>
+      </w:r>
+      <w:proofErr w:type="spellEnd"/>
+      <w:r>
+        <w:t xml:space="preserve"> pruning </w:t>
+      </w:r>
+      <w:proofErr w:type="spellStart"/>
+      <w:r>
+        <w:t>behavior</w:t>
+      </w:r>
+      <w:proofErr w:type="spellEnd"/>
+      <w:r>
+        <w:t>.</w:t>
       </w:r>
     </w:p>
     <w:p>
@@ -1543,6 +1682,7 @@
     </w:p>
     <w:p>
       <w:pPr>
+        <w:jc w:val="center"/>
         <w:rPr>
           <w:b/>
           <w:bCs/>
@@ -1554,7 +1694,265 @@
           <w:bCs/>
         </w:rPr>
         <w:lastRenderedPageBreak/>
+        <w:t xml:space="preserve">Currently I have added interactive </w:t>
+      </w:r>
+      <w:proofErr w:type="spellStart"/>
+      <w:r>
+        <w:rPr>
+          <w:b/>
+          <w:bCs/>
+        </w:rPr>
+        <w:t>streamlit</w:t>
+      </w:r>
+      <w:proofErr w:type="spellEnd"/>
+      <w:r>
+        <w:rPr>
+          <w:b/>
+          <w:bCs/>
+        </w:rPr>
+        <w:t xml:space="preserve"> frontend:</w:t>
+      </w:r>
+    </w:p>
+    <w:p>
+      <w:pPr>
+        <w:jc w:val="center"/>
+        <w:rPr>
+          <w:b/>
+          <w:bCs/>
+        </w:rPr>
+      </w:pPr>
+      <w:r>
+        <w:rPr>
+          <w:b/>
+          <w:bCs/>
+        </w:rPr>
+        <w:br/>
+      </w:r>
+      <w:r>
+        <w:rPr>
+          <w:b/>
+          <w:bCs/>
+        </w:rPr>
+        <w:drawing>
+          <wp:inline distT="0" distB="0" distL="0" distR="0" wp14:anchorId="1D48E920" wp14:editId="409453D8">
+            <wp:extent cx="5731510" cy="3067685"/>
+            <wp:effectExtent l="0" t="0" r="2540" b="0"/>
+            <wp:docPr id="889265629" name="Picture 1"/>
+            <wp:cNvGraphicFramePr>
+              <a:graphicFrameLocks xmlns:a="http://schemas.openxmlformats.org/drawingml/2006/main" noChangeAspect="1"/>
+            </wp:cNvGraphicFramePr>
+            <a:graphic xmlns:a="http://schemas.openxmlformats.org/drawingml/2006/main">
+              <a:graphicData uri="http://schemas.openxmlformats.org/drawingml/2006/picture">
+                <pic:pic xmlns:pic="http://schemas.openxmlformats.org/drawingml/2006/picture">
+                  <pic:nvPicPr>
+                    <pic:cNvPr id="889265629" name=""/>
+                    <pic:cNvPicPr/>
+                  </pic:nvPicPr>
+                  <pic:blipFill>
+                    <a:blip r:embed="rId12"/>
+                    <a:stretch>
+                      <a:fillRect/>
+                    </a:stretch>
+                  </pic:blipFill>
+                  <pic:spPr>
+                    <a:xfrm>
+                      <a:off x="0" y="0"/>
+                      <a:ext cx="5731510" cy="3067685"/>
+                    </a:xfrm>
+                    <a:prstGeom prst="rect">
+                      <a:avLst/>
+                    </a:prstGeom>
+                  </pic:spPr>
+                </pic:pic>
+              </a:graphicData>
+            </a:graphic>
+          </wp:inline>
+        </w:drawing>
+      </w:r>
+    </w:p>
+    <w:p>
+      <w:pPr>
+        <w:jc w:val="center"/>
+        <w:rPr>
+          <w:b/>
+          <w:bCs/>
+        </w:rPr>
+      </w:pPr>
+    </w:p>
+    <w:p>
+      <w:pPr>
+        <w:jc w:val="center"/>
+        <w:rPr>
+          <w:b/>
+          <w:bCs/>
+        </w:rPr>
+      </w:pPr>
+    </w:p>
+    <w:p>
+      <w:pPr>
+        <w:jc w:val="center"/>
+        <w:rPr>
+          <w:b/>
+          <w:bCs/>
+        </w:rPr>
+      </w:pPr>
+    </w:p>
+    <w:p>
+      <w:pPr>
+        <w:jc w:val="center"/>
+      </w:pPr>
+      <w:r>
+        <w:rPr>
+          <w:noProof/>
+        </w:rPr>
+        <w:drawing>
+          <wp:inline distT="0" distB="0" distL="0" distR="0" wp14:anchorId="384A2C6D" wp14:editId="02DE445C">
+            <wp:extent cx="5731510" cy="3223895"/>
+            <wp:effectExtent l="0" t="0" r="2540" b="0"/>
+            <wp:docPr id="1164420376" name="Picture 1"/>
+            <wp:cNvGraphicFramePr>
+              <a:graphicFrameLocks xmlns:a="http://schemas.openxmlformats.org/drawingml/2006/main" noChangeAspect="1"/>
+            </wp:cNvGraphicFramePr>
+            <a:graphic xmlns:a="http://schemas.openxmlformats.org/drawingml/2006/main">
+              <a:graphicData uri="http://schemas.openxmlformats.org/drawingml/2006/picture">
+                <pic:pic xmlns:pic="http://schemas.openxmlformats.org/drawingml/2006/picture">
+                  <pic:nvPicPr>
+                    <pic:cNvPr id="1164420376" name=""/>
+                    <pic:cNvPicPr/>
+                  </pic:nvPicPr>
+                  <pic:blipFill>
+                    <a:blip r:embed="rId13"/>
+                    <a:stretch>
+                      <a:fillRect/>
+                    </a:stretch>
+                  </pic:blipFill>
+                  <pic:spPr>
+                    <a:xfrm>
+                      <a:off x="0" y="0"/>
+                      <a:ext cx="5731510" cy="3223895"/>
+                    </a:xfrm>
+                    <a:prstGeom prst="rect">
+                      <a:avLst/>
+                    </a:prstGeom>
+                  </pic:spPr>
+                </pic:pic>
+              </a:graphicData>
+            </a:graphic>
+          </wp:inline>
+        </w:drawing>
+      </w:r>
+    </w:p>
+    <w:p>
+      <w:pPr>
+        <w:jc w:val="center"/>
+      </w:pPr>
+      <w:r>
+        <w:rPr>
+          <w:noProof/>
+        </w:rPr>
+        <w:lastRenderedPageBreak/>
+        <w:drawing>
+          <wp:inline distT="0" distB="0" distL="0" distR="0" wp14:anchorId="049067BB" wp14:editId="7934D90D">
+            <wp:extent cx="5731510" cy="3223895"/>
+            <wp:effectExtent l="0" t="0" r="2540" b="0"/>
+            <wp:docPr id="1333494205" name="Picture 1"/>
+            <wp:cNvGraphicFramePr>
+              <a:graphicFrameLocks xmlns:a="http://schemas.openxmlformats.org/drawingml/2006/main" noChangeAspect="1"/>
+            </wp:cNvGraphicFramePr>
+            <a:graphic xmlns:a="http://schemas.openxmlformats.org/drawingml/2006/main">
+              <a:graphicData uri="http://schemas.openxmlformats.org/drawingml/2006/picture">
+                <pic:pic xmlns:pic="http://schemas.openxmlformats.org/drawingml/2006/picture">
+                  <pic:nvPicPr>
+                    <pic:cNvPr id="1333494205" name=""/>
+                    <pic:cNvPicPr/>
+                  </pic:nvPicPr>
+                  <pic:blipFill>
+                    <a:blip r:embed="rId14"/>
+                    <a:stretch>
+                      <a:fillRect/>
+                    </a:stretch>
+                  </pic:blipFill>
+                  <pic:spPr>
+                    <a:xfrm>
+                      <a:off x="0" y="0"/>
+                      <a:ext cx="5731510" cy="3223895"/>
+                    </a:xfrm>
+                    <a:prstGeom prst="rect">
+                      <a:avLst/>
+                    </a:prstGeom>
+                  </pic:spPr>
+                </pic:pic>
+              </a:graphicData>
+            </a:graphic>
+          </wp:inline>
+        </w:drawing>
+      </w:r>
+    </w:p>
+    <w:p>
+      <w:pPr>
+        <w:jc w:val="center"/>
+      </w:pPr>
+      <w:r>
+        <w:rPr>
+          <w:noProof/>
+        </w:rPr>
+        <w:drawing>
+          <wp:inline distT="0" distB="0" distL="0" distR="0" wp14:anchorId="3F00DCE9" wp14:editId="08738325">
+            <wp:extent cx="5731510" cy="3223895"/>
+            <wp:effectExtent l="0" t="0" r="2540" b="0"/>
+            <wp:docPr id="1054589761" name="Picture 1"/>
+            <wp:cNvGraphicFramePr>
+              <a:graphicFrameLocks xmlns:a="http://schemas.openxmlformats.org/drawingml/2006/main" noChangeAspect="1"/>
+            </wp:cNvGraphicFramePr>
+            <a:graphic xmlns:a="http://schemas.openxmlformats.org/drawingml/2006/main">
+              <a:graphicData uri="http://schemas.openxmlformats.org/drawingml/2006/picture">
+                <pic:pic xmlns:pic="http://schemas.openxmlformats.org/drawingml/2006/picture">
+                  <pic:nvPicPr>
+                    <pic:cNvPr id="1054589761" name=""/>
+                    <pic:cNvPicPr/>
+                  </pic:nvPicPr>
+                  <pic:blipFill>
+                    <a:blip r:embed="rId15"/>
+                    <a:stretch>
+                      <a:fillRect/>
+                    </a:stretch>
+                  </pic:blipFill>
+                  <pic:spPr>
+                    <a:xfrm>
+                      <a:off x="0" y="0"/>
+                      <a:ext cx="5731510" cy="3223895"/>
+                    </a:xfrm>
+                    <a:prstGeom prst="rect">
+                      <a:avLst/>
+                    </a:prstGeom>
+                  </pic:spPr>
+                </pic:pic>
+              </a:graphicData>
+            </a:graphic>
+          </wp:inline>
+        </w:drawing>
+      </w:r>
+    </w:p>
+    <w:p>
+      <w:pPr>
+        <w:rPr>
+          <w:b/>
+          <w:bCs/>
+        </w:rPr>
+      </w:pPr>
+      <w:r>
+        <w:rPr>
+          <w:b/>
+          <w:bCs/>
+        </w:rPr>
         <w:t>LLM-Based Explanation Layer</w:t>
+      </w:r>
+      <w:r>
+        <w:rPr>
+          <w:b/>
+          <w:bCs/>
+        </w:rPr>
+        <w:t xml:space="preserve"> </w:t>
       </w:r>
     </w:p>
     <w:p>
@@ -1564,8 +1962,13 @@
           <w:numId w:val="8"/>
         </w:numPr>
       </w:pPr>
-      <w:r>
-        <w:t>FastAPI endpoint: /explain-results</w:t>
+      <w:proofErr w:type="spellStart"/>
+      <w:r>
+        <w:t>FastAPI</w:t>
+      </w:r>
+      <w:proofErr w:type="spellEnd"/>
+      <w:r>
+        <w:t xml:space="preserve"> endpoint: /explain-results</w:t>
       </w:r>
     </w:p>
     <w:p>
@@ -1633,6 +2036,7 @@
         <w:ind w:left="360"/>
       </w:pPr>
       <w:r>
+        <w:lastRenderedPageBreak/>
         <w:br/>
         <w:t>File name: fig6_system_flow_gemini_api.png</w:t>
       </w:r>
@@ -1689,7 +2093,15 @@
         </w:numPr>
       </w:pPr>
       <w:r>
-        <w:t>Build FastAPI backend service</w:t>
+        <w:t xml:space="preserve">Build </w:t>
+      </w:r>
+      <w:proofErr w:type="spellStart"/>
+      <w:r>
+        <w:t>FastAPI</w:t>
+      </w:r>
+      <w:proofErr w:type="spellEnd"/>
+      <w:r>
+        <w:t xml:space="preserve"> backend service</w:t>
       </w:r>
     </w:p>
     <w:p>
@@ -1806,8 +2218,13 @@
           <w:numId w:val="12"/>
         </w:numPr>
       </w:pPr>
-      <w:r>
-        <w:t>NameError due to running cells out of order</w:t>
+      <w:proofErr w:type="spellStart"/>
+      <w:r>
+        <w:t>NameError</w:t>
+      </w:r>
+      <w:proofErr w:type="spellEnd"/>
+      <w:r>
+        <w:t xml:space="preserve"> due to running cells out of order</w:t>
       </w:r>
     </w:p>
     <w:p>
@@ -1843,8 +2260,21 @@
           <w:numId w:val="13"/>
         </w:numPr>
       </w:pPr>
-      <w:r>
-        <w:t>get_gates() not defined properly</w:t>
+      <w:proofErr w:type="spellStart"/>
+      <w:r>
+        <w:t>get_</w:t>
+      </w:r>
+      <w:proofErr w:type="gramStart"/>
+      <w:r>
+        <w:t>gates</w:t>
+      </w:r>
+      <w:proofErr w:type="spellEnd"/>
+      <w:r>
+        <w:t>(</w:t>
+      </w:r>
+      <w:proofErr w:type="gramEnd"/>
+      <w:r>
+        <w:t>) not defined properly</w:t>
       </w:r>
     </w:p>
     <w:p>
@@ -1892,7 +2322,6 @@
         </w:numPr>
       </w:pPr>
       <w:r>
-        <w:lastRenderedPageBreak/>
         <w:t>Learned proper dataset reuse</w:t>
       </w:r>
     </w:p>
@@ -1967,7 +2396,15 @@
         </w:numPr>
       </w:pPr>
       <w:r>
-        <w:t>Learned correct PyTorch practices</w:t>
+        <w:t xml:space="preserve">Learned correct </w:t>
+      </w:r>
+      <w:proofErr w:type="spellStart"/>
+      <w:r>
+        <w:t>PyTorch</w:t>
+      </w:r>
+      <w:proofErr w:type="spellEnd"/>
+      <w:r>
+        <w:t xml:space="preserve"> practices</w:t>
       </w:r>
     </w:p>
     <w:p>
@@ -1993,6 +2430,7 @@
         </w:numPr>
       </w:pPr>
       <w:r>
+        <w:lastRenderedPageBreak/>
         <w:t>Initially ineffective λ values</w:t>
       </w:r>
     </w:p>
@@ -2093,8 +2531,17 @@
           <w:b/>
           <w:bCs/>
         </w:rPr>
-        <w:t>10. Optimization Behavior</w:t>
-      </w:r>
+        <w:t xml:space="preserve">10. Optimization </w:t>
+      </w:r>
+      <w:proofErr w:type="spellStart"/>
+      <w:r>
+        <w:rPr>
+          <w:b/>
+          <w:bCs/>
+        </w:rPr>
+        <w:t>Behavior</w:t>
+      </w:r>
+      <w:proofErr w:type="spellEnd"/>
     </w:p>
     <w:p>
       <w:pPr>
@@ -2190,7 +2637,15 @@
         </w:numPr>
       </w:pPr>
       <w:r>
-        <w:t>custom prunable neural layer</w:t>
+        <w:t xml:space="preserve">custom </w:t>
+      </w:r>
+      <w:proofErr w:type="spellStart"/>
+      <w:r>
+        <w:t>prunable</w:t>
+      </w:r>
+      <w:proofErr w:type="spellEnd"/>
+      <w:r>
+        <w:t xml:space="preserve"> neural layer</w:t>
       </w:r>
     </w:p>
     <w:p>
@@ -2256,7 +2711,6 @@
         </w:numPr>
       </w:pPr>
       <w:r>
-        <w:lastRenderedPageBreak/>
         <w:t>gate distribution visualization</w:t>
       </w:r>
     </w:p>
@@ -2269,8 +2723,17 @@
           <w:b/>
           <w:bCs/>
         </w:rPr>
-        <w:t>soft pruning behavior</w:t>
-      </w:r>
+        <w:t xml:space="preserve">soft pruning </w:t>
+      </w:r>
+      <w:proofErr w:type="spellStart"/>
+      <w:r>
+        <w:rPr>
+          <w:b/>
+          <w:bCs/>
+        </w:rPr>
+        <w:t>behavior</w:t>
+      </w:r>
+      <w:proofErr w:type="spellEnd"/>
       <w:r>
         <w:t xml:space="preserve"> and a clear trade-off between performance and sparsity.</w:t>
       </w:r>
@@ -2332,6 +2795,7 @@
         </w:numPr>
       </w:pPr>
       <w:r>
+        <w:lastRenderedPageBreak/>
         <w:t>debugging real ML systems</w:t>
       </w:r>
     </w:p>
@@ -2343,8 +2807,13 @@
         </w:numPr>
       </w:pPr>
       <w:r>
-        <w:t>balancing theory with practical behavior</w:t>
-      </w:r>
+        <w:t xml:space="preserve">balancing theory with practical </w:t>
+      </w:r>
+      <w:proofErr w:type="spellStart"/>
+      <w:r>
+        <w:t>behavior</w:t>
+      </w:r>
+      <w:proofErr w:type="spellEnd"/>
     </w:p>
     <w:p>
       <w:r>

</xml_diff>